<commit_message>
Incorpora CI aprobada y actualiza el informe final de ShopFast
</commit_message>
<xml_diff>
--- a/entregables/EP2_Informe_ShopFast_Actualizado.docx
+++ b/entregables/EP2_Informe_ShopFast_Actualizado.docx
@@ -4806,7 +4806,19 @@
     </w:p>
     <w:p>
       <w:r>
-        <w:t>Pruebas locales: 27 originales adaptadas, 11 EP2, 4 del exportador y 4 del cierre seguro, 46 aprobadas. CloudFormation pasó cfn-lint. La imagen Linux amd64 pasó build y smoke en CloudShell. El estado de GitHub Actions debe comprobarse en la ejecución de CI; el despliegue OIDC no se ejecutó.</w:t>
+        <w:t>Pruebas locales: 27 originales adaptadas, 11 EP2, 4 del exportador y 4 del cierre seguro, 46 aprobadas. CloudFormation pasó cfn-lint. La imagen Linux amd64 pasó build y smoke en CloudShell.</w:t>
+      </w:r>
+    </w:p>
+    <w:p>
+      <w:hyperlink r:id="rId16">
+        <w:r>
+          <w:t>GitHub Actions aprobó pruebas, CloudFormation y Docker para la revisión 5314dc0</w:t>
+        </w:r>
+      </w:hyperlink>
+    </w:p>
+    <w:p>
+      <w:r>
+        <w:t>La ejecución CI registrada terminó correctamente. El despliegue automático OIDC a AWS permanece sin configurar y no se ejecutó.</w:t>
       </w:r>
     </w:p>
     <w:p>
@@ -4862,7 +4874,7 @@
       <w:pPr>
         <w:spacing w:after="80"/>
       </w:pPr>
-      <w:hyperlink r:id="rId16">
+      <w:hyperlink r:id="rId17">
         <w:r>
           <w:t>Amazon Web Services. (s. f.). Amazon ECS services.</w:t>
         </w:r>
@@ -4872,7 +4884,7 @@
       <w:pPr>
         <w:spacing w:after="80"/>
       </w:pPr>
-      <w:hyperlink r:id="rId17">
+      <w:hyperlink r:id="rId18">
         <w:r>
           <w:t>Amazon Web Services. (s. f.). Handling errors for an SQS event source in Lambda.</w:t>
         </w:r>
@@ -4882,7 +4894,7 @@
       <w:pPr>
         <w:spacing w:after="80"/>
       </w:pPr>
-      <w:hyperlink r:id="rId18">
+      <w:hyperlink r:id="rId19">
         <w:r>
           <w:t>Amazon Web Services. (s. f.). Setting a schedule pattern for scheduled rules in Amazon EventBridge.</w:t>
         </w:r>
@@ -4892,7 +4904,7 @@
       <w:pPr>
         <w:spacing w:after="80"/>
       </w:pPr>
-      <w:hyperlink r:id="rId19">
+      <w:hyperlink r:id="rId20">
         <w:r>
           <w:t>Amazon Web Services. (2026). ShopFast EP2 2 réplicas y 4 réplicas [Estimaciones de AWS Pricing Calculator].</w:t>
         </w:r>
@@ -4902,7 +4914,7 @@
       <w:pPr>
         <w:spacing w:after="80"/>
       </w:pPr>
-      <w:hyperlink r:id="rId20">
+      <w:hyperlink r:id="rId21">
         <w:r>
           <w:t>Peña, M., y Yantzen, B. (2026). Recomendador e-commerce [Repositorio de software, base 1cc9149].</w:t>
         </w:r>

</xml_diff>